<commit_message>
CS1101 Unit 8: Rewrite discussion — natural voice, flowing Part 2, closing question
</commit_message>
<xml_diff>
--- a/CS1101_Programming_Fundamentals/Unit8_Files/Discussion/Unit8_Discussion_Assignment.docx
+++ b/CS1101_Programming_Fundamentals/Unit8_Files/Discussion/Unit8_Discussion_Assignment.docx
@@ -2,7 +2,7 @@
 <file path=word/document.xml><?xml version="1.0" encoding="utf-8"?>
 <w:document xmlns:w="http://schemas.openxmlformats.org/wordprocessingml/2006/main" xmlns:m="http://schemas.openxmlformats.org/officeDocument/2006/math" xmlns:r="http://schemas.openxmlformats.org/officeDocument/2006/relationships" xmlns:o="urn:schemas-microsoft-com:office:office" xmlns:v="urn:schemas-microsoft-com:vml" xmlns:w10="urn:schemas-microsoft-com:office:word" xmlns:a="http://schemas.openxmlformats.org/drawingml/2006/main" xmlns:pic="http://schemas.openxmlformats.org/drawingml/2006/picture" xmlns:wp="http://schemas.openxmlformats.org/drawingml/2006/wordprocessingDrawing">
   <w:body>
-    <w:bookmarkStart w:id="16" w:name="Xc56743dc49137c2c0c4a7107096daec4de742af"/>
+    <w:bookmarkStart w:id="12" w:name="Xc56743dc49137c2c0c4a7107096daec4de742af"/>
     <w:p>
       <w:pPr>
         <w:pStyle w:val="Heading1"/>
@@ -121,7 +121,7 @@
         </w:pict>
       </w:r>
     </w:p>
-    <w:bookmarkStart w:id="13" w:name="Xdbbc6b87741628fe10afbe2893fb34ad90970c7"/>
+    <w:bookmarkStart w:id="9" w:name="X79d3b2ad4f5650703db2651e16a791cdd7d0483"/>
     <w:p>
       <w:pPr>
         <w:pStyle w:val="Heading2"/>
@@ -132,21 +132,7 @@
           <w:rFonts w:ascii="Times New Roman" w:hAnsi="Times New Roman"/>
           <w:sz w:val="24"/>
         </w:rPr>
-        <w:t xml:space="preserve">Part 1: Exception Handling for File Errors</w:t>
-      </w:r>
-    </w:p>
-    <w:bookmarkStart w:id="9" w:name="what-are-file-exceptions"/>
-    <w:p>
-      <w:pPr>
-        <w:pStyle w:val="Heading3"/>
-        <w:spacing w:line="480" w:lineRule="auto" w:after="0"/>
-      </w:pPr>
-      <w:r>
-        <w:rPr>
-          <w:rFonts w:ascii="Times New Roman" w:hAnsi="Times New Roman"/>
-          <w:sz w:val="24"/>
-        </w:rPr>
-        <w:t xml:space="preserve">What Are File Exceptions?</w:t>
+        <w:t xml:space="preserve">Part 1: How Exception Handling Helps with File Errors</w:t>
       </w:r>
     </w:p>
     <w:p>
@@ -159,51 +145,7 @@
           <w:rFonts w:ascii="Times New Roman" w:hAnsi="Times New Roman"/>
           <w:sz w:val="24"/>
         </w:rPr>
-        <w:t xml:space="preserve">When a Python program tries to open or read a file, several things can go wrong: the file might not exist, the program might not have permission to access it, or the path might point to a directory instead of a file. Without exception handling, any of these situations causes the program to crash immediately with an unhandled error. Python’s</w:t>
-      </w:r>
-      <w:r>
-        <w:rPr>
-          <w:rFonts w:ascii="Times New Roman" w:hAnsi="Times New Roman"/>
-          <w:sz w:val="24"/>
-        </w:rPr>
-        <w:t xml:space="preserve"> </w:t>
-      </w:r>
-      <w:r>
-        <w:rPr>
-          <w:rStyle w:val="VerbatimChar"/>
-          <w:rFonts w:ascii="Times New Roman" w:hAnsi="Times New Roman"/>
-          <w:sz w:val="24"/>
-        </w:rPr>
-        <w:t xml:space="preserve">try</w:t>
-      </w:r>
-      <w:r>
-        <w:rPr>
-          <w:rFonts w:ascii="Times New Roman" w:hAnsi="Times New Roman"/>
-          <w:sz w:val="24"/>
-        </w:rPr>
-        <w:t xml:space="preserve">/</w:t>
-      </w:r>
-      <w:r>
-        <w:rPr>
-          <w:rStyle w:val="VerbatimChar"/>
-          <w:rFonts w:ascii="Times New Roman" w:hAnsi="Times New Roman"/>
-          <w:sz w:val="24"/>
-        </w:rPr>
-        <w:t xml:space="preserve">except</w:t>
-      </w:r>
-      <w:r>
-        <w:rPr>
-          <w:rFonts w:ascii="Times New Roman" w:hAnsi="Times New Roman"/>
-          <w:sz w:val="24"/>
-        </w:rPr>
-        <w:t xml:space="preserve"> </w:t>
-      </w:r>
-      <w:r>
-        <w:rPr>
-          <w:rFonts w:ascii="Times New Roman" w:hAnsi="Times New Roman"/>
-          <w:sz w:val="24"/>
-        </w:rPr>
-        <w:t xml:space="preserve">blocks allow the program to anticipate these failures, catch them gracefully, and respond with a meaningful message rather than an abrupt crash (Downey, 2015, p. 145).</w:t>
+        <w:t xml:space="preserve">One of the first things I noticed when working with files in Python is how many things can quietly go wrong before your program even gets to do anything useful. The file might not exist, you might not have permission to open it, or the path you typed might point to a folder instead of a file. Without exception handling, any of these situations causes Python to raise an error and stop the program immediately — which is frustrating for users and unhelpful for debugging.</w:t>
       </w:r>
     </w:p>
     <w:p>
@@ -216,7 +158,51 @@
           <w:rFonts w:ascii="Times New Roman" w:hAnsi="Times New Roman"/>
           <w:sz w:val="24"/>
         </w:rPr>
-        <w:t xml:space="preserve">As Downey (2015) explains,</w:t>
+        <w:t xml:space="preserve">Python’s</w:t>
+      </w:r>
+      <w:r>
+        <w:rPr>
+          <w:rFonts w:ascii="Times New Roman" w:hAnsi="Times New Roman"/>
+          <w:sz w:val="24"/>
+        </w:rPr>
+        <w:t xml:space="preserve"> </w:t>
+      </w:r>
+      <w:r>
+        <w:rPr>
+          <w:rStyle w:val="VerbatimChar"/>
+          <w:rFonts w:ascii="Times New Roman" w:hAnsi="Times New Roman"/>
+          <w:sz w:val="24"/>
+        </w:rPr>
+        <w:t xml:space="preserve">try</w:t>
+      </w:r>
+      <w:r>
+        <w:rPr>
+          <w:rFonts w:ascii="Times New Roman" w:hAnsi="Times New Roman"/>
+          <w:sz w:val="24"/>
+        </w:rPr>
+        <w:t xml:space="preserve">/</w:t>
+      </w:r>
+      <w:r>
+        <w:rPr>
+          <w:rStyle w:val="VerbatimChar"/>
+          <w:rFonts w:ascii="Times New Roman" w:hAnsi="Times New Roman"/>
+          <w:sz w:val="24"/>
+        </w:rPr>
+        <w:t xml:space="preserve">except</w:t>
+      </w:r>
+      <w:r>
+        <w:rPr>
+          <w:rFonts w:ascii="Times New Roman" w:hAnsi="Times New Roman"/>
+          <w:sz w:val="24"/>
+        </w:rPr>
+        <w:t xml:space="preserve"> </w:t>
+      </w:r>
+      <w:r>
+        <w:rPr>
+          <w:rFonts w:ascii="Times New Roman" w:hAnsi="Times New Roman"/>
+          <w:sz w:val="24"/>
+        </w:rPr>
+        <w:t xml:space="preserve">blocks solve this by letting you anticipate specific failures and respond to them gracefully. As Downey (2015) explains,</w:t>
       </w:r>
       <w:r>
         <w:rPr>
@@ -295,7 +281,7 @@
           <w:rFonts w:ascii="Times New Roman" w:hAnsi="Times New Roman"/>
           <w:sz w:val="24"/>
         </w:rPr>
-        <w:t xml:space="preserve">block contains the code that might raise an exception; the</w:t>
+        <w:t xml:space="preserve">block wraps the code that might fail; the</w:t>
       </w:r>
       <w:r>
         <w:rPr>
@@ -324,7 +310,7 @@
           <w:rFonts w:ascii="Times New Roman" w:hAnsi="Times New Roman"/>
           <w:sz w:val="24"/>
         </w:rPr>
-        <w:t xml:space="preserve">block specifies which exception to catch and what to do when it occurs. Python matches the raised exception against the named exception in the</w:t>
+        <w:t xml:space="preserve">block names the specific exception to catch and defines what to do when it occurs. If the exception matches, the handler runs instead of the program crashing. If it doesn’t match, the error propagates normally — which is exactly what you want, because a bare</w:t>
       </w:r>
       <w:r>
         <w:rPr>
@@ -339,40 +325,38 @@
           <w:rFonts w:ascii="Times New Roman" w:hAnsi="Times New Roman"/>
           <w:sz w:val="24"/>
         </w:rPr>
-        <w:t xml:space="preserve">except</w:t>
-      </w:r>
-      <w:r>
-        <w:rPr>
-          <w:rFonts w:ascii="Times New Roman" w:hAnsi="Times New Roman"/>
-          <w:sz w:val="24"/>
-        </w:rPr>
-        <w:t xml:space="preserve"> </w:t>
-      </w:r>
-      <w:r>
-        <w:rPr>
-          <w:rFonts w:ascii="Times New Roman" w:hAnsi="Times New Roman"/>
-          <w:sz w:val="24"/>
-        </w:rPr>
-        <w:t xml:space="preserve">clause — if they match, the handler runs instead of the program terminating.</w:t>
-      </w:r>
-    </w:p>
-    <w:bookmarkEnd w:id="9"/>
-    <w:bookmarkStart w:id="10" w:name="python-example"/>
-    <w:p>
-      <w:pPr>
-        <w:pStyle w:val="Heading3"/>
-        <w:spacing w:line="480" w:lineRule="auto" w:after="0"/>
-      </w:pPr>
-      <w:r>
-        <w:rPr>
-          <w:rFonts w:ascii="Times New Roman" w:hAnsi="Times New Roman"/>
-          <w:sz w:val="24"/>
-        </w:rPr>
-        <w:t xml:space="preserve">Python Example</w:t>
+        <w:t xml:space="preserve">except:</w:t>
+      </w:r>
+      <w:r>
+        <w:rPr>
+          <w:rFonts w:ascii="Times New Roman" w:hAnsi="Times New Roman"/>
+          <w:sz w:val="24"/>
+        </w:rPr>
+        <w:t xml:space="preserve"> </w:t>
+      </w:r>
+      <w:r>
+        <w:rPr>
+          <w:rFonts w:ascii="Times New Roman" w:hAnsi="Times New Roman"/>
+          <w:sz w:val="24"/>
+        </w:rPr>
+        <w:t xml:space="preserve">that catches everything can hide bugs you didn’t know existed.</w:t>
       </w:r>
     </w:p>
     <w:p>
       <w:pPr>
+        <w:pStyle w:val="BodyText"/>
+        <w:spacing w:line="480" w:lineRule="auto" w:after="0"/>
+      </w:pPr>
+      <w:r>
+        <w:rPr>
+          <w:rFonts w:ascii="Times New Roman" w:hAnsi="Times New Roman"/>
+          <w:sz w:val="24"/>
+        </w:rPr>
+        <w:t xml:space="preserve">Here is an example that handles three of the most common file errors:</w:t>
+      </w:r>
+    </w:p>
+    <w:p>
+      <w:pPr>
         <w:pStyle w:val="SourceCode"/>
         <w:spacing w:line="480" w:lineRule="auto" w:after="0"/>
       </w:pPr>
@@ -1272,19 +1256,19 @@
         <w:t xml:space="preserve">)</w:t>
       </w:r>
     </w:p>
-    <w:bookmarkEnd w:id="10"/>
-    <w:bookmarkStart w:id="11" w:name="output"/>
     <w:p>
       <w:pPr>
-        <w:pStyle w:val="Heading3"/>
+        <w:pStyle w:val="FirstParagraph"/>
         <w:spacing w:line="480" w:lineRule="auto" w:after="0"/>
       </w:pPr>
       <w:r>
         <w:rPr>
           <w:rFonts w:ascii="Times New Roman" w:hAnsi="Times New Roman"/>
-          <w:sz w:val="24"/>
-        </w:rPr>
-        <w:t xml:space="preserve">Output</w:t>
+          <w:b/>
+          <w:bCs/>
+          <w:sz w:val="24"/>
+        </w:rPr>
+        <w:t xml:space="preserve">Output:</w:t>
       </w:r>
     </w:p>
     <w:p>
@@ -1353,319 +1337,291 @@
         <w:t xml:space="preserve">Error: '/tmp' is a directory, not a file.</w:t>
       </w:r>
     </w:p>
-    <w:bookmarkEnd w:id="11"/>
-    <w:bookmarkStart w:id="12" w:name="explanation"/>
     <w:p>
       <w:pPr>
-        <w:pStyle w:val="Heading3"/>
+        <w:pStyle w:val="FirstParagraph"/>
         <w:spacing w:line="480" w:lineRule="auto" w:after="0"/>
       </w:pPr>
       <w:r>
         <w:rPr>
           <w:rFonts w:ascii="Times New Roman" w:hAnsi="Times New Roman"/>
-          <w:sz w:val="24"/>
-        </w:rPr>
-        <w:t xml:space="preserve">Explanation</w:t>
+          <w:b/>
+          <w:bCs/>
+          <w:sz w:val="24"/>
+        </w:rPr>
+        <w:t xml:space="preserve">What is happening here:</w:t>
+      </w:r>
+      <w:r>
+        <w:rPr>
+          <w:rFonts w:ascii="Times New Roman" w:hAnsi="Times New Roman"/>
+          <w:sz w:val="24"/>
+        </w:rPr>
+        <w:t xml:space="preserve"> </w:t>
+      </w:r>
+      <w:r>
+        <w:rPr>
+          <w:rFonts w:ascii="Times New Roman" w:hAnsi="Times New Roman"/>
+          <w:sz w:val="24"/>
+        </w:rPr>
+        <w:t xml:space="preserve">The function wraps</w:t>
+      </w:r>
+      <w:r>
+        <w:rPr>
+          <w:rFonts w:ascii="Times New Roman" w:hAnsi="Times New Roman"/>
+          <w:sz w:val="24"/>
+        </w:rPr>
+        <w:t xml:space="preserve"> </w:t>
+      </w:r>
+      <w:r>
+        <w:rPr>
+          <w:rStyle w:val="VerbatimChar"/>
+          <w:rFonts w:ascii="Times New Roman" w:hAnsi="Times New Roman"/>
+          <w:sz w:val="24"/>
+        </w:rPr>
+        <w:t xml:space="preserve">open()</w:t>
+      </w:r>
+      <w:r>
+        <w:rPr>
+          <w:rFonts w:ascii="Times New Roman" w:hAnsi="Times New Roman"/>
+          <w:sz w:val="24"/>
+        </w:rPr>
+        <w:t xml:space="preserve"> </w:t>
+      </w:r>
+      <w:r>
+        <w:rPr>
+          <w:rFonts w:ascii="Times New Roman" w:hAnsi="Times New Roman"/>
+          <w:sz w:val="24"/>
+        </w:rPr>
+        <w:t xml:space="preserve">inside a</w:t>
+      </w:r>
+      <w:r>
+        <w:rPr>
+          <w:rFonts w:ascii="Times New Roman" w:hAnsi="Times New Roman"/>
+          <w:sz w:val="24"/>
+        </w:rPr>
+        <w:t xml:space="preserve"> </w:t>
+      </w:r>
+      <w:r>
+        <w:rPr>
+          <w:rStyle w:val="VerbatimChar"/>
+          <w:rFonts w:ascii="Times New Roman" w:hAnsi="Times New Roman"/>
+          <w:sz w:val="24"/>
+        </w:rPr>
+        <w:t xml:space="preserve">try</w:t>
+      </w:r>
+      <w:r>
+        <w:rPr>
+          <w:rFonts w:ascii="Times New Roman" w:hAnsi="Times New Roman"/>
+          <w:sz w:val="24"/>
+        </w:rPr>
+        <w:t xml:space="preserve"> </w:t>
+      </w:r>
+      <w:r>
+        <w:rPr>
+          <w:rFonts w:ascii="Times New Roman" w:hAnsi="Times New Roman"/>
+          <w:sz w:val="24"/>
+        </w:rPr>
+        <w:t xml:space="preserve">block. When</w:t>
+      </w:r>
+      <w:r>
+        <w:rPr>
+          <w:rFonts w:ascii="Times New Roman" w:hAnsi="Times New Roman"/>
+          <w:sz w:val="24"/>
+        </w:rPr>
+        <w:t xml:space="preserve"> </w:t>
+      </w:r>
+      <w:r>
+        <w:rPr>
+          <w:rStyle w:val="VerbatimChar"/>
+          <w:rFonts w:ascii="Times New Roman" w:hAnsi="Times New Roman"/>
+          <w:sz w:val="24"/>
+        </w:rPr>
+        <w:t xml:space="preserve">"ghost_file.txt"</w:t>
+      </w:r>
+      <w:r>
+        <w:rPr>
+          <w:rFonts w:ascii="Times New Roman" w:hAnsi="Times New Roman"/>
+          <w:sz w:val="24"/>
+        </w:rPr>
+        <w:t xml:space="preserve"> </w:t>
+      </w:r>
+      <w:r>
+        <w:rPr>
+          <w:rFonts w:ascii="Times New Roman" w:hAnsi="Times New Roman"/>
+          <w:sz w:val="24"/>
+        </w:rPr>
+        <w:t xml:space="preserve">is passed, Python raises</w:t>
+      </w:r>
+      <w:r>
+        <w:rPr>
+          <w:rFonts w:ascii="Times New Roman" w:hAnsi="Times New Roman"/>
+          <w:sz w:val="24"/>
+        </w:rPr>
+        <w:t xml:space="preserve"> </w:t>
+      </w:r>
+      <w:r>
+        <w:rPr>
+          <w:rStyle w:val="VerbatimChar"/>
+          <w:rFonts w:ascii="Times New Roman" w:hAnsi="Times New Roman"/>
+          <w:sz w:val="24"/>
+        </w:rPr>
+        <w:t xml:space="preserve">FileNotFoundError</w:t>
+      </w:r>
+      <w:r>
+        <w:rPr>
+          <w:rFonts w:ascii="Times New Roman" w:hAnsi="Times New Roman"/>
+          <w:sz w:val="24"/>
+        </w:rPr>
+        <w:t xml:space="preserve"> </w:t>
+      </w:r>
+      <w:r>
+        <w:rPr>
+          <w:rFonts w:ascii="Times New Roman" w:hAnsi="Times New Roman"/>
+          <w:sz w:val="24"/>
+        </w:rPr>
+        <w:t xml:space="preserve">because no such file exists on disk — the first</w:t>
+      </w:r>
+      <w:r>
+        <w:rPr>
+          <w:rFonts w:ascii="Times New Roman" w:hAnsi="Times New Roman"/>
+          <w:sz w:val="24"/>
+        </w:rPr>
+        <w:t xml:space="preserve"> </w:t>
+      </w:r>
+      <w:r>
+        <w:rPr>
+          <w:rStyle w:val="VerbatimChar"/>
+          <w:rFonts w:ascii="Times New Roman" w:hAnsi="Times New Roman"/>
+          <w:sz w:val="24"/>
+        </w:rPr>
+        <w:t xml:space="preserve">except</w:t>
+      </w:r>
+      <w:r>
+        <w:rPr>
+          <w:rFonts w:ascii="Times New Roman" w:hAnsi="Times New Roman"/>
+          <w:sz w:val="24"/>
+        </w:rPr>
+        <w:t xml:space="preserve"> </w:t>
+      </w:r>
+      <w:r>
+        <w:rPr>
+          <w:rFonts w:ascii="Times New Roman" w:hAnsi="Times New Roman"/>
+          <w:sz w:val="24"/>
+        </w:rPr>
+        <w:t xml:space="preserve">clause catches it and prints a clear message. When</w:t>
+      </w:r>
+      <w:r>
+        <w:rPr>
+          <w:rFonts w:ascii="Times New Roman" w:hAnsi="Times New Roman"/>
+          <w:sz w:val="24"/>
+        </w:rPr>
+        <w:t xml:space="preserve"> </w:t>
+      </w:r>
+      <w:r>
+        <w:rPr>
+          <w:rStyle w:val="VerbatimChar"/>
+          <w:rFonts w:ascii="Times New Roman" w:hAnsi="Times New Roman"/>
+          <w:sz w:val="24"/>
+        </w:rPr>
+        <w:t xml:space="preserve">"/tmp"</w:t>
+      </w:r>
+      <w:r>
+        <w:rPr>
+          <w:rFonts w:ascii="Times New Roman" w:hAnsi="Times New Roman"/>
+          <w:sz w:val="24"/>
+        </w:rPr>
+        <w:t xml:space="preserve"> </w:t>
+      </w:r>
+      <w:r>
+        <w:rPr>
+          <w:rFonts w:ascii="Times New Roman" w:hAnsi="Times New Roman"/>
+          <w:sz w:val="24"/>
+        </w:rPr>
+        <w:t xml:space="preserve">is passed — a real path, but a directory — Python raises</w:t>
+      </w:r>
+      <w:r>
+        <w:rPr>
+          <w:rFonts w:ascii="Times New Roman" w:hAnsi="Times New Roman"/>
+          <w:sz w:val="24"/>
+        </w:rPr>
+        <w:t xml:space="preserve"> </w:t>
+      </w:r>
+      <w:r>
+        <w:rPr>
+          <w:rStyle w:val="VerbatimChar"/>
+          <w:rFonts w:ascii="Times New Roman" w:hAnsi="Times New Roman"/>
+          <w:sz w:val="24"/>
+        </w:rPr>
+        <w:t xml:space="preserve">IsADirectoryError</w:t>
+      </w:r>
+      <w:r>
+        <w:rPr>
+          <w:rFonts w:ascii="Times New Roman" w:hAnsi="Times New Roman"/>
+          <w:sz w:val="24"/>
+        </w:rPr>
+        <w:t xml:space="preserve">, which the third</w:t>
+      </w:r>
+      <w:r>
+        <w:rPr>
+          <w:rFonts w:ascii="Times New Roman" w:hAnsi="Times New Roman"/>
+          <w:sz w:val="24"/>
+        </w:rPr>
+        <w:t xml:space="preserve"> </w:t>
+      </w:r>
+      <w:r>
+        <w:rPr>
+          <w:rStyle w:val="VerbatimChar"/>
+          <w:rFonts w:ascii="Times New Roman" w:hAnsi="Times New Roman"/>
+          <w:sz w:val="24"/>
+        </w:rPr>
+        <w:t xml:space="preserve">except</w:t>
+      </w:r>
+      <w:r>
+        <w:rPr>
+          <w:rFonts w:ascii="Times New Roman" w:hAnsi="Times New Roman"/>
+          <w:sz w:val="24"/>
+        </w:rPr>
+        <w:t xml:space="preserve"> </w:t>
+      </w:r>
+      <w:r>
+        <w:rPr>
+          <w:rFonts w:ascii="Times New Roman" w:hAnsi="Times New Roman"/>
+          <w:sz w:val="24"/>
+        </w:rPr>
+        <w:t xml:space="preserve">clause handles. The</w:t>
+      </w:r>
+      <w:r>
+        <w:rPr>
+          <w:rFonts w:ascii="Times New Roman" w:hAnsi="Times New Roman"/>
+          <w:sz w:val="24"/>
+        </w:rPr>
+        <w:t xml:space="preserve"> </w:t>
+      </w:r>
+      <w:r>
+        <w:rPr>
+          <w:rStyle w:val="VerbatimChar"/>
+          <w:rFonts w:ascii="Times New Roman" w:hAnsi="Times New Roman"/>
+          <w:sz w:val="24"/>
+        </w:rPr>
+        <w:t xml:space="preserve">PermissionError</w:t>
+      </w:r>
+      <w:r>
+        <w:rPr>
+          <w:rFonts w:ascii="Times New Roman" w:hAnsi="Times New Roman"/>
+          <w:sz w:val="24"/>
+        </w:rPr>
+        <w:t xml:space="preserve"> </w:t>
+      </w:r>
+      <w:r>
+        <w:rPr>
+          <w:rFonts w:ascii="Times New Roman" w:hAnsi="Times New Roman"/>
+          <w:sz w:val="24"/>
+        </w:rPr>
+        <w:t xml:space="preserve">handler covers the case where the file exists but the current user lacks read access.</w:t>
       </w:r>
     </w:p>
     <w:p>
       <w:pPr>
-        <w:pStyle w:val="FirstParagraph"/>
-        <w:spacing w:line="480" w:lineRule="auto" w:after="0"/>
-      </w:pPr>
-      <w:r>
-        <w:rPr>
-          <w:rFonts w:ascii="Times New Roman" w:hAnsi="Times New Roman"/>
-          <w:sz w:val="24"/>
-        </w:rPr>
-        <w:t xml:space="preserve">The function</w:t>
-      </w:r>
-      <w:r>
-        <w:rPr>
-          <w:rFonts w:ascii="Times New Roman" w:hAnsi="Times New Roman"/>
-          <w:sz w:val="24"/>
-        </w:rPr>
-        <w:t xml:space="preserve"> </w:t>
-      </w:r>
-      <w:r>
-        <w:rPr>
-          <w:rStyle w:val="VerbatimChar"/>
-          <w:rFonts w:ascii="Times New Roman" w:hAnsi="Times New Roman"/>
-          <w:sz w:val="24"/>
-        </w:rPr>
-        <w:t xml:space="preserve">read_file_safely</w:t>
-      </w:r>
-      <w:r>
-        <w:rPr>
-          <w:rFonts w:ascii="Times New Roman" w:hAnsi="Times New Roman"/>
-          <w:sz w:val="24"/>
-        </w:rPr>
-        <w:t xml:space="preserve"> </w:t>
-      </w:r>
-      <w:r>
-        <w:rPr>
-          <w:rFonts w:ascii="Times New Roman" w:hAnsi="Times New Roman"/>
-          <w:sz w:val="24"/>
-        </w:rPr>
-        <w:t xml:space="preserve">wraps the</w:t>
-      </w:r>
-      <w:r>
-        <w:rPr>
-          <w:rFonts w:ascii="Times New Roman" w:hAnsi="Times New Roman"/>
-          <w:sz w:val="24"/>
-        </w:rPr>
-        <w:t xml:space="preserve"> </w:t>
-      </w:r>
-      <w:r>
-        <w:rPr>
-          <w:rStyle w:val="VerbatimChar"/>
-          <w:rFonts w:ascii="Times New Roman" w:hAnsi="Times New Roman"/>
-          <w:sz w:val="24"/>
-        </w:rPr>
-        <w:t xml:space="preserve">open()</w:t>
-      </w:r>
-      <w:r>
-        <w:rPr>
-          <w:rFonts w:ascii="Times New Roman" w:hAnsi="Times New Roman"/>
-          <w:sz w:val="24"/>
-        </w:rPr>
-        <w:t xml:space="preserve"> </w:t>
-      </w:r>
-      <w:r>
-        <w:rPr>
-          <w:rFonts w:ascii="Times New Roman" w:hAnsi="Times New Roman"/>
-          <w:sz w:val="24"/>
-        </w:rPr>
-        <w:t xml:space="preserve">call inside a</w:t>
-      </w:r>
-      <w:r>
-        <w:rPr>
-          <w:rFonts w:ascii="Times New Roman" w:hAnsi="Times New Roman"/>
-          <w:sz w:val="24"/>
-        </w:rPr>
-        <w:t xml:space="preserve"> </w:t>
-      </w:r>
-      <w:r>
-        <w:rPr>
-          <w:rStyle w:val="VerbatimChar"/>
-          <w:rFonts w:ascii="Times New Roman" w:hAnsi="Times New Roman"/>
-          <w:sz w:val="24"/>
-        </w:rPr>
-        <w:t xml:space="preserve">try</w:t>
-      </w:r>
-      <w:r>
-        <w:rPr>
-          <w:rFonts w:ascii="Times New Roman" w:hAnsi="Times New Roman"/>
-          <w:sz w:val="24"/>
-        </w:rPr>
-        <w:t xml:space="preserve"> </w:t>
-      </w:r>
-      <w:r>
-        <w:rPr>
-          <w:rFonts w:ascii="Times New Roman" w:hAnsi="Times New Roman"/>
-          <w:sz w:val="24"/>
-        </w:rPr>
-        <w:t xml:space="preserve">block. When</w:t>
-      </w:r>
-      <w:r>
-        <w:rPr>
-          <w:rFonts w:ascii="Times New Roman" w:hAnsi="Times New Roman"/>
-          <w:sz w:val="24"/>
-        </w:rPr>
-        <w:t xml:space="preserve"> </w:t>
-      </w:r>
-      <w:r>
-        <w:rPr>
-          <w:rStyle w:val="VerbatimChar"/>
-          <w:rFonts w:ascii="Times New Roman" w:hAnsi="Times New Roman"/>
-          <w:sz w:val="24"/>
-        </w:rPr>
-        <w:t xml:space="preserve">"ghost_file.txt"</w:t>
-      </w:r>
-      <w:r>
-        <w:rPr>
-          <w:rFonts w:ascii="Times New Roman" w:hAnsi="Times New Roman"/>
-          <w:sz w:val="24"/>
-        </w:rPr>
-        <w:t xml:space="preserve"> </w:t>
-      </w:r>
-      <w:r>
-        <w:rPr>
-          <w:rFonts w:ascii="Times New Roman" w:hAnsi="Times New Roman"/>
-          <w:sz w:val="24"/>
-        </w:rPr>
-        <w:t xml:space="preserve">is passed, Python raises a</w:t>
-      </w:r>
-      <w:r>
-        <w:rPr>
-          <w:rFonts w:ascii="Times New Roman" w:hAnsi="Times New Roman"/>
-          <w:sz w:val="24"/>
-        </w:rPr>
-        <w:t xml:space="preserve"> </w:t>
-      </w:r>
-      <w:r>
-        <w:rPr>
-          <w:rStyle w:val="VerbatimChar"/>
-          <w:rFonts w:ascii="Times New Roman" w:hAnsi="Times New Roman"/>
-          <w:sz w:val="24"/>
-        </w:rPr>
-        <w:t xml:space="preserve">FileNotFoundError</w:t>
-      </w:r>
-      <w:r>
-        <w:rPr>
-          <w:rFonts w:ascii="Times New Roman" w:hAnsi="Times New Roman"/>
-          <w:sz w:val="24"/>
-        </w:rPr>
-        <w:t xml:space="preserve"> </w:t>
-      </w:r>
-      <w:r>
-        <w:rPr>
-          <w:rFonts w:ascii="Times New Roman" w:hAnsi="Times New Roman"/>
-          <w:sz w:val="24"/>
-        </w:rPr>
-        <w:t xml:space="preserve">because no such file exists on disk. The first</w:t>
-      </w:r>
-      <w:r>
-        <w:rPr>
-          <w:rFonts w:ascii="Times New Roman" w:hAnsi="Times New Roman"/>
-          <w:sz w:val="24"/>
-        </w:rPr>
-        <w:t xml:space="preserve"> </w:t>
-      </w:r>
-      <w:r>
-        <w:rPr>
-          <w:rStyle w:val="VerbatimChar"/>
-          <w:rFonts w:ascii="Times New Roman" w:hAnsi="Times New Roman"/>
-          <w:sz w:val="24"/>
-        </w:rPr>
-        <w:t xml:space="preserve">except FileNotFoundError</w:t>
-      </w:r>
-      <w:r>
-        <w:rPr>
-          <w:rFonts w:ascii="Times New Roman" w:hAnsi="Times New Roman"/>
-          <w:sz w:val="24"/>
-        </w:rPr>
-        <w:t xml:space="preserve"> </w:t>
-      </w:r>
-      <w:r>
-        <w:rPr>
-          <w:rFonts w:ascii="Times New Roman" w:hAnsi="Times New Roman"/>
-          <w:sz w:val="24"/>
-        </w:rPr>
-        <w:t xml:space="preserve">clause catches it and prints a user-friendly message instead of crashing. When</w:t>
-      </w:r>
-      <w:r>
-        <w:rPr>
-          <w:rFonts w:ascii="Times New Roman" w:hAnsi="Times New Roman"/>
-          <w:sz w:val="24"/>
-        </w:rPr>
-        <w:t xml:space="preserve"> </w:t>
-      </w:r>
-      <w:r>
-        <w:rPr>
-          <w:rStyle w:val="VerbatimChar"/>
-          <w:rFonts w:ascii="Times New Roman" w:hAnsi="Times New Roman"/>
-          <w:sz w:val="24"/>
-        </w:rPr>
-        <w:t xml:space="preserve">"/tmp"</w:t>
-      </w:r>
-      <w:r>
-        <w:rPr>
-          <w:rFonts w:ascii="Times New Roman" w:hAnsi="Times New Roman"/>
-          <w:sz w:val="24"/>
-        </w:rPr>
-        <w:t xml:space="preserve"> </w:t>
-      </w:r>
-      <w:r>
-        <w:rPr>
-          <w:rFonts w:ascii="Times New Roman" w:hAnsi="Times New Roman"/>
-          <w:sz w:val="24"/>
-        </w:rPr>
-        <w:t xml:space="preserve">is passed — a valid path but a directory, not a file — Python raises</w:t>
-      </w:r>
-      <w:r>
-        <w:rPr>
-          <w:rFonts w:ascii="Times New Roman" w:hAnsi="Times New Roman"/>
-          <w:sz w:val="24"/>
-        </w:rPr>
-        <w:t xml:space="preserve"> </w:t>
-      </w:r>
-      <w:r>
-        <w:rPr>
-          <w:rStyle w:val="VerbatimChar"/>
-          <w:rFonts w:ascii="Times New Roman" w:hAnsi="Times New Roman"/>
-          <w:sz w:val="24"/>
-        </w:rPr>
-        <w:t xml:space="preserve">IsADirectoryError</w:t>
-      </w:r>
-      <w:r>
-        <w:rPr>
-          <w:rFonts w:ascii="Times New Roman" w:hAnsi="Times New Roman"/>
-          <w:sz w:val="24"/>
-        </w:rPr>
-        <w:t xml:space="preserve">, which the third</w:t>
-      </w:r>
-      <w:r>
-        <w:rPr>
-          <w:rFonts w:ascii="Times New Roman" w:hAnsi="Times New Roman"/>
-          <w:sz w:val="24"/>
-        </w:rPr>
-        <w:t xml:space="preserve"> </w:t>
-      </w:r>
-      <w:r>
-        <w:rPr>
-          <w:rStyle w:val="VerbatimChar"/>
-          <w:rFonts w:ascii="Times New Roman" w:hAnsi="Times New Roman"/>
-          <w:sz w:val="24"/>
-        </w:rPr>
-        <w:t xml:space="preserve">except</w:t>
-      </w:r>
-      <w:r>
-        <w:rPr>
-          <w:rFonts w:ascii="Times New Roman" w:hAnsi="Times New Roman"/>
-          <w:sz w:val="24"/>
-        </w:rPr>
-        <w:t xml:space="preserve"> </w:t>
-      </w:r>
-      <w:r>
-        <w:rPr>
-          <w:rFonts w:ascii="Times New Roman" w:hAnsi="Times New Roman"/>
-          <w:sz w:val="24"/>
-        </w:rPr>
-        <w:t xml:space="preserve">clause catches. The</w:t>
-      </w:r>
-      <w:r>
-        <w:rPr>
-          <w:rFonts w:ascii="Times New Roman" w:hAnsi="Times New Roman"/>
-          <w:sz w:val="24"/>
-        </w:rPr>
-        <w:t xml:space="preserve"> </w:t>
-      </w:r>
-      <w:r>
-        <w:rPr>
-          <w:rStyle w:val="VerbatimChar"/>
-          <w:rFonts w:ascii="Times New Roman" w:hAnsi="Times New Roman"/>
-          <w:sz w:val="24"/>
-        </w:rPr>
-        <w:t xml:space="preserve">PermissionError</w:t>
-      </w:r>
-      <w:r>
-        <w:rPr>
-          <w:rFonts w:ascii="Times New Roman" w:hAnsi="Times New Roman"/>
-          <w:sz w:val="24"/>
-        </w:rPr>
-        <w:t xml:space="preserve"> </w:t>
-      </w:r>
-      <w:r>
-        <w:rPr>
-          <w:rFonts w:ascii="Times New Roman" w:hAnsi="Times New Roman"/>
-          <w:sz w:val="24"/>
-        </w:rPr>
-        <w:t xml:space="preserve">handler covers the case where the file exists but the current user lacks read access.</w:t>
-      </w:r>
-    </w:p>
-    <w:p>
-      <w:pPr>
         <w:pStyle w:val="BodyText"/>
         <w:spacing w:line="480" w:lineRule="auto" w:after="0"/>
       </w:pPr>
@@ -1674,7 +1630,7 @@
           <w:rFonts w:ascii="Times New Roman" w:hAnsi="Times New Roman"/>
           <w:sz w:val="24"/>
         </w:rPr>
-        <w:t xml:space="preserve">Using named exception types in each</w:t>
+        <w:t xml:space="preserve">Two design choices here are worth noting. First, I used the</w:t>
       </w:r>
       <w:r>
         <w:rPr>
@@ -1689,6 +1645,35 @@
           <w:rFonts w:ascii="Times New Roman" w:hAnsi="Times New Roman"/>
           <w:sz w:val="24"/>
         </w:rPr>
+        <w:t xml:space="preserve">with</w:t>
+      </w:r>
+      <w:r>
+        <w:rPr>
+          <w:rFonts w:ascii="Times New Roman" w:hAnsi="Times New Roman"/>
+          <w:sz w:val="24"/>
+        </w:rPr>
+        <w:t xml:space="preserve"> </w:t>
+      </w:r>
+      <w:r>
+        <w:rPr>
+          <w:rFonts w:ascii="Times New Roman" w:hAnsi="Times New Roman"/>
+          <w:sz w:val="24"/>
+        </w:rPr>
+        <w:t xml:space="preserve">statement as a context manager, which guarantees the file is closed automatically when the block exits — even if an error occurs inside it (Downey, 2015, p. 141). Second, each</w:t>
+      </w:r>
+      <w:r>
+        <w:rPr>
+          <w:rFonts w:ascii="Times New Roman" w:hAnsi="Times New Roman"/>
+          <w:sz w:val="24"/>
+        </w:rPr>
+        <w:t xml:space="preserve"> </w:t>
+      </w:r>
+      <w:r>
+        <w:rPr>
+          <w:rStyle w:val="VerbatimChar"/>
+          <w:rFonts w:ascii="Times New Roman" w:hAnsi="Times New Roman"/>
+          <w:sz w:val="24"/>
+        </w:rPr>
         <w:t xml:space="preserve">except</w:t>
       </w:r>
       <w:r>
@@ -1703,7 +1688,7 @@
           <w:rFonts w:ascii="Times New Roman" w:hAnsi="Times New Roman"/>
           <w:sz w:val="24"/>
         </w:rPr>
-        <w:t xml:space="preserve">clause — rather than a bare</w:t>
+        <w:t xml:space="preserve">clause names a specific exception rather than using a bare</w:t>
       </w:r>
       <w:r>
         <w:rPr>
@@ -1725,43 +1710,7 @@
           <w:rFonts w:ascii="Times New Roman" w:hAnsi="Times New Roman"/>
           <w:sz w:val="24"/>
         </w:rPr>
-        <w:t xml:space="preserve"> </w:t>
-      </w:r>
-      <w:r>
-        <w:rPr>
-          <w:rFonts w:ascii="Times New Roman" w:hAnsi="Times New Roman"/>
-          <w:sz w:val="24"/>
-        </w:rPr>
-        <w:t xml:space="preserve">— is important because it catches only the specific errors the program knows how to handle, allowing unexpected errors to propagate normally (Downey, 2015, p. 145). The</w:t>
-      </w:r>
-      <w:r>
-        <w:rPr>
-          <w:rFonts w:ascii="Times New Roman" w:hAnsi="Times New Roman"/>
-          <w:sz w:val="24"/>
-        </w:rPr>
-        <w:t xml:space="preserve"> </w:t>
-      </w:r>
-      <w:r>
-        <w:rPr>
-          <w:rStyle w:val="VerbatimChar"/>
-          <w:rFonts w:ascii="Times New Roman" w:hAnsi="Times New Roman"/>
-          <w:sz w:val="24"/>
-        </w:rPr>
-        <w:t xml:space="preserve">with</w:t>
-      </w:r>
-      <w:r>
-        <w:rPr>
-          <w:rFonts w:ascii="Times New Roman" w:hAnsi="Times New Roman"/>
-          <w:sz w:val="24"/>
-        </w:rPr>
-        <w:t xml:space="preserve"> </w:t>
-      </w:r>
-      <w:r>
-        <w:rPr>
-          <w:rFonts w:ascii="Times New Roman" w:hAnsi="Times New Roman"/>
-          <w:sz w:val="24"/>
-        </w:rPr>
-        <w:t xml:space="preserve">statement ensures the file is closed automatically even if an error occurs inside the block.</w:t>
+        <w:t xml:space="preserve">. This is important because it means only the errors the program knows how to handle are caught; anything unexpected still propagates and gets noticed (Downey, 2015, p. 145).</w:t>
       </w:r>
     </w:p>
     <w:p>
@@ -1778,9 +1727,8 @@
         </w:pict>
       </w:r>
     </w:p>
-    <w:bookmarkEnd w:id="12"/>
-    <w:bookmarkEnd w:id="13"/>
-    <w:bookmarkStart w:id="14" w:name="Xd9600167a4a3a09999bfa43a4c7a22cf1445766"/>
+    <w:bookmarkEnd w:id="9"/>
+    <w:bookmarkStart w:id="10" w:name="Xd9600167a4a3a09999bfa43a4c7a22cf1445766"/>
     <w:p>
       <w:pPr>
         <w:pStyle w:val="Heading2"/>
@@ -1804,7 +1752,7 @@
           <w:rFonts w:ascii="Times New Roman" w:hAnsi="Times New Roman"/>
           <w:sz w:val="24"/>
         </w:rPr>
-        <w:t xml:space="preserve">In a large production program, file errors require a more systematic approach than simple print statements. The following strategies would be appropriate:</w:t>
+        <w:t xml:space="preserve">In a small script, printing an error message and moving on is usually fine. In a large production program, though, that approach breaks down quickly — nobody is watching the console, errors need to be traceable after the fact, and a single file failure should not bring down an entire system.</w:t>
       </w:r>
     </w:p>
     <w:p>
@@ -1815,18 +1763,9 @@
       <w:r>
         <w:rPr>
           <w:rFonts w:ascii="Times New Roman" w:hAnsi="Times New Roman"/>
-          <w:b/>
-          <w:bCs/>
-          <w:sz w:val="24"/>
-        </w:rPr>
-        <w:t xml:space="preserve">Logging instead of printing</w:t>
-      </w:r>
-      <w:r>
-        <w:rPr>
-          <w:rFonts w:ascii="Times New Roman" w:hAnsi="Times New Roman"/>
-          <w:sz w:val="24"/>
-        </w:rPr>
-        <w:t xml:space="preserve">: Production systems use a logging framework (such as Python’s built-in</w:t>
+          <w:sz w:val="24"/>
+        </w:rPr>
+        <w:t xml:space="preserve">The first thing I would change is replacing</w:t>
       </w:r>
       <w:r>
         <w:rPr>
@@ -1841,6 +1780,35 @@
           <w:rFonts w:ascii="Times New Roman" w:hAnsi="Times New Roman"/>
           <w:sz w:val="24"/>
         </w:rPr>
+        <w:t xml:space="preserve">print()</w:t>
+      </w:r>
+      <w:r>
+        <w:rPr>
+          <w:rFonts w:ascii="Times New Roman" w:hAnsi="Times New Roman"/>
+          <w:sz w:val="24"/>
+        </w:rPr>
+        <w:t xml:space="preserve"> </w:t>
+      </w:r>
+      <w:r>
+        <w:rPr>
+          <w:rFonts w:ascii="Times New Roman" w:hAnsi="Times New Roman"/>
+          <w:sz w:val="24"/>
+        </w:rPr>
+        <w:t xml:space="preserve">statements with a proper logging framework. Python’s built-in</w:t>
+      </w:r>
+      <w:r>
+        <w:rPr>
+          <w:rFonts w:ascii="Times New Roman" w:hAnsi="Times New Roman"/>
+          <w:sz w:val="24"/>
+        </w:rPr>
+        <w:t xml:space="preserve"> </w:t>
+      </w:r>
+      <w:r>
+        <w:rPr>
+          <w:rStyle w:val="VerbatimChar"/>
+          <w:rFonts w:ascii="Times New Roman" w:hAnsi="Times New Roman"/>
+          <w:sz w:val="24"/>
+        </w:rPr>
         <w:t xml:space="preserve">logging</w:t>
       </w:r>
       <w:r>
@@ -1855,7 +1823,7 @@
           <w:rFonts w:ascii="Times New Roman" w:hAnsi="Times New Roman"/>
           <w:sz w:val="24"/>
         </w:rPr>
-        <w:t xml:space="preserve">module) to record errors with timestamps, severity levels, and contextual information. This creates an audit trail that developers can review after the fact, rather than relying on console output that may never be seen.</w:t>
+        <w:t xml:space="preserve">module records errors with timestamps, severity levels, and contextual information that gets written to a log file. This creates a permanent audit trail that developers can search through hours or days after an incident, which is far more useful than console output that disappears the moment the terminal closes.</w:t>
       </w:r>
     </w:p>
     <w:p>
@@ -1866,47 +1834,9 @@
       <w:r>
         <w:rPr>
           <w:rFonts w:ascii="Times New Roman" w:hAnsi="Times New Roman"/>
-          <w:b/>
-          <w:bCs/>
-          <w:sz w:val="24"/>
-        </w:rPr>
-        <w:t xml:space="preserve">Retry logic for transient errors</w:t>
-      </w:r>
-      <w:r>
-        <w:rPr>
-          <w:rFonts w:ascii="Times New Roman" w:hAnsi="Times New Roman"/>
-          <w:sz w:val="24"/>
-        </w:rPr>
-        <w:t xml:space="preserve">: Some file errors — particularly on network-mounted file systems — are temporary. A production program might catch an</w:t>
-      </w:r>
-      <w:r>
-        <w:rPr>
-          <w:rFonts w:ascii="Times New Roman" w:hAnsi="Times New Roman"/>
-          <w:sz w:val="24"/>
-        </w:rPr>
-        <w:t xml:space="preserve"> </w:t>
-      </w:r>
-      <w:r>
-        <w:rPr>
-          <w:rStyle w:val="VerbatimChar"/>
-          <w:rFonts w:ascii="Times New Roman" w:hAnsi="Times New Roman"/>
-          <w:sz w:val="24"/>
-        </w:rPr>
-        <w:t xml:space="preserve">OSError</w:t>
-      </w:r>
-      <w:r>
-        <w:rPr>
-          <w:rFonts w:ascii="Times New Roman" w:hAnsi="Times New Roman"/>
-          <w:sz w:val="24"/>
-        </w:rPr>
-        <w:t xml:space="preserve"> </w:t>
-      </w:r>
-      <w:r>
-        <w:rPr>
-          <w:rFonts w:ascii="Times New Roman" w:hAnsi="Times New Roman"/>
-          <w:sz w:val="24"/>
-        </w:rPr>
-        <w:t xml:space="preserve">and retry the operation two or three times with a short delay before giving up, rather than failing immediately on the first attempt.</w:t>
+          <w:sz w:val="24"/>
+        </w:rPr>
+        <w:t xml:space="preserve">The second consideration is distinguishing between errors that are permanent and errors that are temporary. On a network-mounted file system, for example, a file might be temporarily unavailable due to a network hiccup rather than genuinely missing. A production program would implement retry logic — catching the error, waiting a short interval, and trying again a fixed number of times before giving up. This prevents a transient network issue from being treated as a fatal failure.</w:t>
       </w:r>
     </w:p>
     <w:p>
@@ -1917,18 +1847,9 @@
       <w:r>
         <w:rPr>
           <w:rFonts w:ascii="Times New Roman" w:hAnsi="Times New Roman"/>
-          <w:b/>
-          <w:bCs/>
-          <w:sz w:val="24"/>
-        </w:rPr>
-        <w:t xml:space="preserve">Graceful degradation</w:t>
-      </w:r>
-      <w:r>
-        <w:rPr>
-          <w:rFonts w:ascii="Times New Roman" w:hAnsi="Times New Roman"/>
-          <w:sz w:val="24"/>
-        </w:rPr>
-        <w:t xml:space="preserve">: If a non-critical file cannot be read, the program should continue operating with reduced functionality rather than shutting down entirely. For example, if a configuration file is missing, the program could fall back to default settings and log a warning.</w:t>
+          <w:sz w:val="24"/>
+        </w:rPr>
+        <w:t xml:space="preserve">Third, I would think carefully about graceful degradation. If a non-critical file — say, a user preferences file — cannot be read, the program should continue running with sensible defaults rather than shutting down entirely. The error gets logged, the user might see a notification, but the application keeps working. Contrast this with a critical configuration file: if that is missing, the program genuinely cannot proceed, and a clear, informative error message should explain exactly what is missing and where it should be.</w:t>
       </w:r>
     </w:p>
     <w:p>
@@ -1939,40 +1860,9 @@
       <w:r>
         <w:rPr>
           <w:rFonts w:ascii="Times New Roman" w:hAnsi="Times New Roman"/>
-          <w:b/>
-          <w:bCs/>
-          <w:sz w:val="24"/>
-        </w:rPr>
-        <w:t xml:space="preserve">User notification and recovery options</w:t>
-      </w:r>
-      <w:r>
-        <w:rPr>
-          <w:rFonts w:ascii="Times New Roman" w:hAnsi="Times New Roman"/>
-          <w:sz w:val="24"/>
-        </w:rPr>
-        <w:t xml:space="preserve">: In applications with a user interface, file errors should be surfaced to the user with clear, actionable messages — not raw Python tracebacks. The user should be offered options such as selecting a different file, creating a new one, or canceling the operation.</w:t>
-      </w:r>
-    </w:p>
-    <w:p>
-      <w:pPr>
-        <w:pStyle w:val="BodyText"/>
-        <w:spacing w:line="480" w:lineRule="auto" w:after="0"/>
-      </w:pPr>
-      <w:r>
-        <w:rPr>
-          <w:rFonts w:ascii="Times New Roman" w:hAnsi="Times New Roman"/>
-          <w:b/>
-          <w:bCs/>
-          <w:sz w:val="24"/>
-        </w:rPr>
-        <w:t xml:space="preserve">Centralized error handling</w:t>
-      </w:r>
-      <w:r>
-        <w:rPr>
-          <w:rFonts w:ascii="Times New Roman" w:hAnsi="Times New Roman"/>
-          <w:sz w:val="24"/>
-        </w:rPr>
-        <w:t xml:space="preserve">: Rather than duplicating</w:t>
+          <w:sz w:val="24"/>
+        </w:rPr>
+        <w:t xml:space="preserve">Finally, in a large codebase, I would avoid scattering</w:t>
       </w:r>
       <w:r>
         <w:rPr>
@@ -2016,7 +1906,7 @@
           <w:rFonts w:ascii="Times New Roman" w:hAnsi="Times New Roman"/>
           <w:sz w:val="24"/>
         </w:rPr>
-        <w:t xml:space="preserve">blocks throughout the codebase, production programs typically define a centralized error-handling layer or decorator that applies consistent error management across all file operations.</w:t>
+        <w:t xml:space="preserve">blocks throughout every function that touches a file. Instead, I would define a centralized file-handling utility — a single module or class responsible for all file I/O — so that error handling logic lives in one place, is tested once, and behaves consistently everywhere it is used. This makes the codebase easier to maintain and reduces the risk of one developer handling errors differently from another.</w:t>
       </w:r>
     </w:p>
     <w:p>
@@ -2033,21 +1923,6 @@
         </w:pict>
       </w:r>
     </w:p>
-    <w:bookmarkEnd w:id="14"/>
-    <w:bookmarkStart w:id="15" w:name="references"/>
-    <w:p>
-      <w:pPr>
-        <w:pStyle w:val="Heading2"/>
-        <w:spacing w:line="480" w:lineRule="auto" w:after="0"/>
-      </w:pPr>
-      <w:r>
-        <w:rPr>
-          <w:rFonts w:ascii="Times New Roman" w:hAnsi="Times New Roman"/>
-          <w:sz w:val="24"/>
-        </w:rPr>
-        <w:t xml:space="preserve">References</w:t>
-      </w:r>
-    </w:p>
     <w:p>
       <w:pPr>
         <w:pStyle w:val="FirstParagraph"/>
@@ -2056,82 +1931,76 @@
       <w:r>
         <w:rPr>
           <w:rFonts w:ascii="Times New Roman" w:hAnsi="Times New Roman"/>
-          <w:sz w:val="24"/>
-        </w:rPr>
-        <w:t xml:space="preserve">Downey, A. (2015).</w:t>
-      </w:r>
-      <w:r>
-        <w:rPr>
-          <w:rFonts w:ascii="Times New Roman" w:hAnsi="Times New Roman"/>
-          <w:sz w:val="24"/>
-        </w:rPr>
-        <w:t xml:space="preserve"> </w:t>
-      </w:r>
-      <w:r>
-        <w:rPr>
-          <w:rFonts w:ascii="Times New Roman" w:hAnsi="Times New Roman"/>
-          <w:i/>
-          <w:iCs/>
-          <w:sz w:val="24"/>
-        </w:rPr>
-        <w:t xml:space="preserve">Think Python: How to think like a computer scientist</w:t>
-      </w:r>
-      <w:r>
-        <w:rPr>
-          <w:rFonts w:ascii="Times New Roman" w:hAnsi="Times New Roman"/>
-          <w:sz w:val="24"/>
-        </w:rPr>
-        <w:t xml:space="preserve"> </w:t>
-      </w:r>
-      <w:r>
-        <w:rPr>
-          <w:rFonts w:ascii="Times New Roman" w:hAnsi="Times New Roman"/>
-          <w:sz w:val="24"/>
-        </w:rPr>
-        <w:t xml:space="preserve">(2nd ed.). Green Tea Press. https://greenteapress.com/thinkpython2/thinkpython2.pdf</w:t>
-      </w:r>
-    </w:p>
-    <w:p>
-      <w:pPr>
-        <w:pStyle w:val="BodyText"/>
-        <w:spacing w:line="480" w:lineRule="auto" w:after="0"/>
-      </w:pPr>
-      <w:r>
-        <w:rPr>
-          <w:rFonts w:ascii="Times New Roman" w:hAnsi="Times New Roman"/>
-          <w:sz w:val="24"/>
-        </w:rPr>
-        <w:t xml:space="preserve">Schafer, C. (2016, April 29).</w:t>
-      </w:r>
-      <w:r>
-        <w:rPr>
-          <w:rFonts w:ascii="Times New Roman" w:hAnsi="Times New Roman"/>
-          <w:sz w:val="24"/>
-        </w:rPr>
-        <w:t xml:space="preserve"> </w:t>
-      </w:r>
-      <w:r>
-        <w:rPr>
-          <w:rFonts w:ascii="Times New Roman" w:hAnsi="Times New Roman"/>
-          <w:i/>
-          <w:iCs/>
-          <w:sz w:val="24"/>
-        </w:rPr>
-        <w:t xml:space="preserve">Python tutorial: File objects - Reading and writing to files</w:t>
-      </w:r>
-      <w:r>
-        <w:rPr>
-          <w:rFonts w:ascii="Times New Roman" w:hAnsi="Times New Roman"/>
-          <w:sz w:val="24"/>
-        </w:rPr>
-        <w:t xml:space="preserve"> </w:t>
-      </w:r>
-      <w:r>
-        <w:rPr>
-          <w:rFonts w:ascii="Times New Roman" w:hAnsi="Times New Roman"/>
-          <w:sz w:val="24"/>
-        </w:rPr>
-        <w:t xml:space="preserve">[Video]. YouTube. https://youtu.be/Uh2ebFW8OYM</w:t>
+          <w:b/>
+          <w:bCs/>
+          <w:sz w:val="24"/>
+        </w:rPr>
+        <w:t xml:space="preserve">Discussion Question:</w:t>
+      </w:r>
+      <w:r>
+        <w:rPr>
+          <w:rFonts w:ascii="Times New Roman" w:hAnsi="Times New Roman"/>
+          <w:sz w:val="24"/>
+        </w:rPr>
+        <w:t xml:space="preserve"> </w:t>
+      </w:r>
+      <w:r>
+        <w:rPr>
+          <w:rFonts w:ascii="Times New Roman" w:hAnsi="Times New Roman"/>
+          <w:sz w:val="24"/>
+        </w:rPr>
+        <w:t xml:space="preserve">When you were writing your exception handling code, did you use a single broad</w:t>
+      </w:r>
+      <w:r>
+        <w:rPr>
+          <w:rFonts w:ascii="Times New Roman" w:hAnsi="Times New Roman"/>
+          <w:sz w:val="24"/>
+        </w:rPr>
+        <w:t xml:space="preserve"> </w:t>
+      </w:r>
+      <w:r>
+        <w:rPr>
+          <w:rStyle w:val="VerbatimChar"/>
+          <w:rFonts w:ascii="Times New Roman" w:hAnsi="Times New Roman"/>
+          <w:sz w:val="24"/>
+        </w:rPr>
+        <w:t xml:space="preserve">except Exception</w:t>
+      </w:r>
+      <w:r>
+        <w:rPr>
+          <w:rFonts w:ascii="Times New Roman" w:hAnsi="Times New Roman"/>
+          <w:sz w:val="24"/>
+        </w:rPr>
+        <w:t xml:space="preserve"> </w:t>
+      </w:r>
+      <w:r>
+        <w:rPr>
+          <w:rFonts w:ascii="Times New Roman" w:hAnsi="Times New Roman"/>
+          <w:sz w:val="24"/>
+        </w:rPr>
+        <w:t xml:space="preserve">to catch everything, or did you name specific exceptions like</w:t>
+      </w:r>
+      <w:r>
+        <w:rPr>
+          <w:rFonts w:ascii="Times New Roman" w:hAnsi="Times New Roman"/>
+          <w:sz w:val="24"/>
+        </w:rPr>
+        <w:t xml:space="preserve"> </w:t>
+      </w:r>
+      <w:r>
+        <w:rPr>
+          <w:rStyle w:val="VerbatimChar"/>
+          <w:rFonts w:ascii="Times New Roman" w:hAnsi="Times New Roman"/>
+          <w:sz w:val="24"/>
+        </w:rPr>
+        <w:t xml:space="preserve">FileNotFoundError</w:t>
+      </w:r>
+      <w:r>
+        <w:rPr>
+          <w:rFonts w:ascii="Times New Roman" w:hAnsi="Times New Roman"/>
+          <w:sz w:val="24"/>
+        </w:rPr>
+        <w:t xml:space="preserve">? What made you choose that approach, and did you run into any situations where catching a specific exception wasn’t enough?</w:t>
       </w:r>
     </w:p>
     <w:p>
@@ -2148,6 +2017,21 @@
         </w:pict>
       </w:r>
     </w:p>
+    <w:bookmarkEnd w:id="10"/>
+    <w:bookmarkStart w:id="11" w:name="references"/>
+    <w:p>
+      <w:pPr>
+        <w:pStyle w:val="Heading2"/>
+        <w:spacing w:line="480" w:lineRule="auto" w:after="0"/>
+      </w:pPr>
+      <w:r>
+        <w:rPr>
+          <w:rFonts w:ascii="Times New Roman" w:hAnsi="Times New Roman"/>
+          <w:sz w:val="24"/>
+        </w:rPr>
+        <w:t xml:space="preserve">References</w:t>
+      </w:r>
+    </w:p>
     <w:p>
       <w:pPr>
         <w:pStyle w:val="FirstParagraph"/>
@@ -2156,6 +2040,106 @@
       <w:r>
         <w:rPr>
           <w:rFonts w:ascii="Times New Roman" w:hAnsi="Times New Roman"/>
+          <w:sz w:val="24"/>
+        </w:rPr>
+        <w:t xml:space="preserve">Downey, A. (2015).</w:t>
+      </w:r>
+      <w:r>
+        <w:rPr>
+          <w:rFonts w:ascii="Times New Roman" w:hAnsi="Times New Roman"/>
+          <w:sz w:val="24"/>
+        </w:rPr>
+        <w:t xml:space="preserve"> </w:t>
+      </w:r>
+      <w:r>
+        <w:rPr>
+          <w:rFonts w:ascii="Times New Roman" w:hAnsi="Times New Roman"/>
+          <w:i/>
+          <w:iCs/>
+          <w:sz w:val="24"/>
+        </w:rPr>
+        <w:t xml:space="preserve">Think Python: How to think like a computer scientist</w:t>
+      </w:r>
+      <w:r>
+        <w:rPr>
+          <w:rFonts w:ascii="Times New Roman" w:hAnsi="Times New Roman"/>
+          <w:sz w:val="24"/>
+        </w:rPr>
+        <w:t xml:space="preserve"> </w:t>
+      </w:r>
+      <w:r>
+        <w:rPr>
+          <w:rFonts w:ascii="Times New Roman" w:hAnsi="Times New Roman"/>
+          <w:sz w:val="24"/>
+        </w:rPr>
+        <w:t xml:space="preserve">(2nd ed.). Green Tea Press. https://greenteapress.com/thinkpython2/thinkpython2.pdf</w:t>
+      </w:r>
+    </w:p>
+    <w:p>
+      <w:pPr>
+        <w:pStyle w:val="BodyText"/>
+        <w:spacing w:line="480" w:lineRule="auto" w:after="0"/>
+      </w:pPr>
+      <w:r>
+        <w:rPr>
+          <w:rFonts w:ascii="Times New Roman" w:hAnsi="Times New Roman"/>
+          <w:sz w:val="24"/>
+        </w:rPr>
+        <w:t xml:space="preserve">Schafer, C. (2016, April 29).</w:t>
+      </w:r>
+      <w:r>
+        <w:rPr>
+          <w:rFonts w:ascii="Times New Roman" w:hAnsi="Times New Roman"/>
+          <w:sz w:val="24"/>
+        </w:rPr>
+        <w:t xml:space="preserve"> </w:t>
+      </w:r>
+      <w:r>
+        <w:rPr>
+          <w:rFonts w:ascii="Times New Roman" w:hAnsi="Times New Roman"/>
+          <w:i/>
+          <w:iCs/>
+          <w:sz w:val="24"/>
+        </w:rPr>
+        <w:t xml:space="preserve">Python tutorial: File objects - Reading and writing to files</w:t>
+      </w:r>
+      <w:r>
+        <w:rPr>
+          <w:rFonts w:ascii="Times New Roman" w:hAnsi="Times New Roman"/>
+          <w:sz w:val="24"/>
+        </w:rPr>
+        <w:t xml:space="preserve"> </w:t>
+      </w:r>
+      <w:r>
+        <w:rPr>
+          <w:rFonts w:ascii="Times New Roman" w:hAnsi="Times New Roman"/>
+          <w:sz w:val="24"/>
+        </w:rPr>
+        <w:t xml:space="preserve">[Video]. YouTube. https://youtu.be/Uh2ebFW8OYM</w:t>
+      </w:r>
+    </w:p>
+    <w:p>
+      <w:pPr>
+        <w:spacing w:line="480" w:lineRule="auto" w:after="0"/>
+      </w:pPr>
+      <w:r>
+        <w:rPr>
+          <w:rFonts w:ascii="Times New Roman" w:hAnsi="Times New Roman"/>
+          <w:sz w:val="24"/>
+        </w:rPr>
+        <w:pict>
+          <v:rect style="width:0;height:1.5pt" o:hralign="center" o:hrstd="t" o:hr="t"/>
+        </w:pict>
+      </w:r>
+    </w:p>
+    <w:p>
+      <w:pPr>
+        <w:pStyle w:val="FirstParagraph"/>
+        <w:spacing w:line="480" w:lineRule="auto" w:after="0"/>
+      </w:pPr>
+      <w:r>
+        <w:rPr>
+          <w:rFonts w:ascii="Times New Roman" w:hAnsi="Times New Roman"/>
           <w:b/>
           <w:bCs/>
           <w:sz w:val="24"/>
@@ -2167,11 +2151,11 @@
           <w:rFonts w:ascii="Times New Roman" w:hAnsi="Times New Roman"/>
           <w:sz w:val="24"/>
         </w:rPr>
-        <w:t xml:space="preserve">: ~530 words (body, excluding title and references)</w:t>
+        <w:t xml:space="preserve">: ~750 words (body, excluding title and references)</w:t>
       </w:r>
     </w:p>
-    <w:bookmarkEnd w:id="15"/>
-    <w:bookmarkEnd w:id="16"/>
+    <w:bookmarkEnd w:id="11"/>
+    <w:bookmarkEnd w:id="12"/>
     <w:sectPr>
       <w:footnotePr>
         <w:numRestart w:val="eachSect"/>

</xml_diff>